<commit_message>
fix doc and change comment (OpenFileGDB exists in my drivers maybe i can use it to create GDB from DWG)
</commit_message>
<xml_diff>
--- a/overview.docx
+++ b/overview.docx
@@ -1303,6 +1303,7 @@
           <w:rFonts w:hint="cs"/>
           <w:rtl/>
         </w:rPr>
+        <w:lastRenderedPageBreak/>
         <w:t>התקנה</w:t>
       </w:r>
     </w:p>
@@ -2391,6 +2392,7 @@
         </w:rPr>
       </w:pPr>
       <w:r>
+        <w:lastRenderedPageBreak/>
         <w:t>Docker</w:t>
       </w:r>
     </w:p>
@@ -3914,6 +3916,7 @@
           <w:rFonts w:hint="cs"/>
           <w:rtl/>
         </w:rPr>
+        <w:lastRenderedPageBreak/>
         <w:t>4.  כניסה לקבצים ובדיקת תקינות דרך ה</w:t>
       </w:r>
       <w:r>
@@ -6309,6 +6312,7 @@
                 <w:szCs w:val="21"/>
                 <w14:ligatures w14:val="none"/>
               </w:rPr>
+              <w:lastRenderedPageBreak/>
               <w:t>driver</w:t>
             </w:r>
             <w:r>
@@ -6572,6 +6576,7 @@
           <w:szCs w:val="20"/>
           <w:rtl/>
         </w:rPr>
+        <w:lastRenderedPageBreak/>
         <w:t xml:space="preserve">וממשיכים לעבוד על הקובץ </w:t>
       </w:r>
       <w:r>
@@ -6612,7 +6617,6 @@
         <w:pStyle w:val="a9"/>
         <w:bidi/>
         <w:rPr>
-          <w:rFonts w:hint="cs"/>
           <w:sz w:val="20"/>
           <w:szCs w:val="20"/>
           <w:rtl/>
@@ -6722,6 +6726,7 @@
       <w:r>
         <w:rPr>
           <w:rFonts w:cs="Arial"/>
+          <w:noProof/>
           <w:rtl/>
         </w:rPr>
         <w:drawing>
@@ -7937,6 +7942,7 @@
           <w:rFonts w:hint="cs"/>
           <w:rtl/>
         </w:rPr>
+        <w:lastRenderedPageBreak/>
         <w:t>סיכום תוצאות:</w:t>
       </w:r>
     </w:p>
@@ -8367,7 +8373,6 @@
           <w:szCs w:val="20"/>
           <w:rtl/>
         </w:rPr>
-        <w:lastRenderedPageBreak/>
         <w:t xml:space="preserve">קבצים שעוד לא הצלחתי להמיר. (בגרסא </w:t>
       </w:r>
       <w:r>
@@ -8539,6 +8544,281 @@
       <w:pPr>
         <w:bidi/>
         <w:rPr>
+          <w:sz w:val="20"/>
+          <w:szCs w:val="20"/>
+        </w:rPr>
+      </w:pPr>
+    </w:p>
+    <w:p>
+      <w:pPr>
+        <w:pStyle w:val="1"/>
+        <w:bidi/>
+        <w:rPr>
+          <w:rtl/>
+        </w:rPr>
+      </w:pPr>
+      <w:r>
+        <w:rPr>
+          <w:rFonts w:hint="cs"/>
+          <w:rtl/>
+        </w:rPr>
+        <w:t>סיכום סופי</w:t>
+      </w:r>
+      <w:r>
+        <w:rPr>
+          <w:rtl/>
+        </w:rPr>
+        <w:tab/>
+      </w:r>
+    </w:p>
+    <w:p>
+      <w:pPr>
+        <w:bidi/>
+        <w:rPr>
+          <w:rtl/>
+        </w:rPr>
+      </w:pPr>
+      <w:r>
+        <w:rPr>
+          <w:rFonts w:hint="cs"/>
+          <w:rtl/>
+        </w:rPr>
+        <w:t>יצרתי 3 מחלקות:</w:t>
+      </w:r>
+    </w:p>
+    <w:p>
+      <w:pPr>
+        <w:bidi/>
+        <w:rPr>
+          <w:rtl/>
+        </w:rPr>
+      </w:pPr>
+      <w:r>
+        <w:rPr>
+          <w:rFonts w:hint="cs"/>
+          <w:rtl/>
+        </w:rPr>
+        <w:t xml:space="preserve">1. </w:t>
+      </w:r>
+      <w:r>
+        <w:t>geo_converter</w:t>
+      </w:r>
+      <w:r>
+        <w:rPr>
+          <w:rFonts w:hint="cs"/>
+          <w:rtl/>
+        </w:rPr>
+        <w:t xml:space="preserve"> </w:t>
+      </w:r>
+      <w:r>
+        <w:rPr>
+          <w:rtl/>
+        </w:rPr>
+        <w:t>–</w:t>
+      </w:r>
+      <w:r>
+        <w:rPr>
+          <w:rFonts w:hint="cs"/>
+          <w:rtl/>
+        </w:rPr>
+        <w:t xml:space="preserve"> מנהל את ההמרות.</w:t>
+      </w:r>
+    </w:p>
+    <w:p>
+      <w:pPr>
+        <w:bidi/>
+        <w:rPr>
+          <w:rtl/>
+        </w:rPr>
+      </w:pPr>
+      <w:r>
+        <w:rPr>
+          <w:rFonts w:hint="cs"/>
+          <w:rtl/>
+        </w:rPr>
+        <w:t xml:space="preserve">2. </w:t>
+      </w:r>
+      <w:r>
+        <w:t>OsgeoConverter</w:t>
+      </w:r>
+      <w:r>
+        <w:rPr>
+          <w:rFonts w:hint="cs"/>
+          <w:rtl/>
+        </w:rPr>
+        <w:t xml:space="preserve"> </w:t>
+      </w:r>
+      <w:r>
+        <w:rPr>
+          <w:rtl/>
+        </w:rPr>
+        <w:t>–</w:t>
+      </w:r>
+      <w:r>
+        <w:rPr>
+          <w:rFonts w:hint="cs"/>
+          <w:rtl/>
+        </w:rPr>
+        <w:t xml:space="preserve"> מנהל המרות בעזרת </w:t>
+      </w:r>
+      <w:r>
+        <w:t>GDAL</w:t>
+      </w:r>
+      <w:r>
+        <w:rPr>
+          <w:rFonts w:hint="cs"/>
+          <w:rtl/>
+        </w:rPr>
+        <w:t xml:space="preserve"> בלבד.</w:t>
+      </w:r>
+    </w:p>
+    <w:p>
+      <w:pPr>
+        <w:bidi/>
+        <w:rPr>
+          <w:rtl/>
+        </w:rPr>
+      </w:pPr>
+      <w:r>
+        <w:rPr>
+          <w:rFonts w:hint="cs"/>
+          <w:rtl/>
+        </w:rPr>
+        <w:t xml:space="preserve">3. </w:t>
+      </w:r>
+      <w:r>
+        <w:t>SubprocessConverter</w:t>
+      </w:r>
+      <w:r>
+        <w:rPr>
+          <w:rFonts w:hint="cs"/>
+          <w:rtl/>
+        </w:rPr>
+        <w:t xml:space="preserve"> </w:t>
+      </w:r>
+      <w:r>
+        <w:rPr>
+          <w:rtl/>
+        </w:rPr>
+        <w:t>–</w:t>
+      </w:r>
+      <w:r>
+        <w:rPr>
+          <w:rFonts w:hint="cs"/>
+          <w:rtl/>
+        </w:rPr>
+        <w:t xml:space="preserve"> עוזר ב</w:t>
+      </w:r>
+      <w:r>
+        <w:t>work-around</w:t>
+      </w:r>
+      <w:r>
+        <w:rPr>
+          <w:rFonts w:hint="cs"/>
+          <w:rtl/>
+        </w:rPr>
+        <w:t xml:space="preserve"> בעזרת סאבפרוסס שמשתמש בעיקר בכלי </w:t>
+      </w:r>
+      <w:r>
+        <w:t>dwgread</w:t>
+      </w:r>
+      <w:r>
+        <w:rPr>
+          <w:rFonts w:hint="cs"/>
+          <w:rtl/>
+        </w:rPr>
+        <w:t xml:space="preserve"> עמ להמיר ל</w:t>
+      </w:r>
+      <w:r>
+        <w:t>DXF</w:t>
+      </w:r>
+      <w:r>
+        <w:rPr>
+          <w:rFonts w:hint="cs"/>
+          <w:rtl/>
+        </w:rPr>
+        <w:t>.</w:t>
+      </w:r>
+    </w:p>
+    <w:p>
+      <w:pPr>
+        <w:bidi/>
+        <w:rPr>
+          <w:rtl/>
+        </w:rPr>
+      </w:pPr>
+    </w:p>
+    <w:p>
+      <w:pPr>
+        <w:bidi/>
+        <w:rPr>
+          <w:rFonts w:hint="cs"/>
+          <w:rtl/>
+        </w:rPr>
+      </w:pPr>
+      <w:r>
+        <w:rPr>
+          <w:rFonts w:hint="cs"/>
+          <w:rtl/>
+        </w:rPr>
+        <w:t>אם הגרסא של ה</w:t>
+      </w:r>
+      <w:r>
+        <w:t>DWG</w:t>
+      </w:r>
+      <w:r>
+        <w:rPr>
+          <w:rFonts w:hint="cs"/>
+          <w:rtl/>
+        </w:rPr>
+        <w:t xml:space="preserve"> מתאימה לדריבר של </w:t>
+      </w:r>
+      <w:r>
+        <w:t>GDAL</w:t>
+      </w:r>
+      <w:r>
+        <w:rPr>
+          <w:rFonts w:hint="cs"/>
+          <w:rtl/>
+        </w:rPr>
+        <w:t xml:space="preserve"> נעבוד ישירות איתו, אחרת נמיר בעזרת הכלי </w:t>
+      </w:r>
+      <w:r>
+        <w:t>dwgread</w:t>
+      </w:r>
+      <w:r>
+        <w:rPr>
+          <w:rFonts w:hint="cs"/>
+          <w:rtl/>
+        </w:rPr>
+        <w:t xml:space="preserve"> ל</w:t>
+      </w:r>
+      <w:r>
+        <w:t>DXF</w:t>
+      </w:r>
+      <w:r>
+        <w:rPr>
+          <w:rFonts w:hint="cs"/>
+          <w:rtl/>
+        </w:rPr>
+        <w:t xml:space="preserve"> ונמשיך עם </w:t>
+      </w:r>
+      <w:r>
+        <w:t>GDAL</w:t>
+      </w:r>
+      <w:r>
+        <w:rPr>
+          <w:rFonts w:hint="cs"/>
+          <w:rtl/>
+        </w:rPr>
+        <w:t>.</w:t>
+      </w:r>
+    </w:p>
+    <w:p>
+      <w:pPr>
+        <w:bidi/>
+        <w:rPr>
+          <w:rFonts w:hint="cs"/>
           <w:rtl/>
         </w:rPr>
       </w:pPr>
@@ -8742,16 +9022,7 @@
           <w:szCs w:val="20"/>
           <w:rtl/>
         </w:rPr>
-        <w:t>טסטים</w:t>
-      </w:r>
-      <w:r>
-        <w:rPr>
-          <w:rFonts w:hint="cs"/>
-          <w:sz w:val="20"/>
-          <w:szCs w:val="20"/>
-          <w:rtl/>
-        </w:rPr>
-        <w:t xml:space="preserve"> (</w:t>
+        <w:t>טסטים (</w:t>
       </w:r>
       <w:r>
         <w:rPr>
@@ -8793,82 +9064,6 @@
           <w:rtl/>
         </w:rPr>
         <w:t>להמשיך עם הצורת עבודה שבחרנו עבור שכבה מסובכת יותר (אייל עובד על לשלוח לי אחת כזאת).</w:t>
-      </w:r>
-    </w:p>
-    <w:p>
-      <w:pPr>
-        <w:pStyle w:val="a9"/>
-        <w:numPr>
-          <w:ilvl w:val="0"/>
-          <w:numId w:val="15"/>
-        </w:numPr>
-        <w:bidi/>
-        <w:rPr>
-          <w:sz w:val="20"/>
-          <w:szCs w:val="20"/>
-        </w:rPr>
-      </w:pPr>
-      <w:r>
-        <w:rPr>
-          <w:rFonts w:hint="cs"/>
-          <w:sz w:val="20"/>
-          <w:szCs w:val="20"/>
-          <w:rtl/>
-        </w:rPr>
-        <w:t xml:space="preserve">להתקין </w:t>
-      </w:r>
-      <w:r>
-        <w:rPr>
-          <w:sz w:val="20"/>
-          <w:szCs w:val="20"/>
-        </w:rPr>
-        <w:t>poetry</w:t>
-      </w:r>
-      <w:r>
-        <w:rPr>
-          <w:rFonts w:hint="cs"/>
-          <w:sz w:val="20"/>
-          <w:szCs w:val="20"/>
-          <w:rtl/>
-        </w:rPr>
-        <w:t>.</w:t>
-      </w:r>
-      <w:r>
-        <w:rPr>
-          <w:rFonts w:hint="cs"/>
-          <w:sz w:val="20"/>
-          <w:szCs w:val="20"/>
-          <w:rtl/>
-        </w:rPr>
-        <w:t xml:space="preserve"> עובד גם עם פיפ לכן לא נראלי שבאמת צריך </w:t>
-      </w:r>
-      <w:r>
-        <w:rPr>
-          <w:rFonts w:hint="cs"/>
-          <w:sz w:val="20"/>
-          <w:szCs w:val="20"/>
-          <w:highlight w:val="yellow"/>
-          <w:rtl/>
-        </w:rPr>
-        <w:t>(יש סיכוי שיפתור את הבעיה של ה</w:t>
-      </w:r>
-      <w:r>
-        <w:rPr>
-          <w:sz w:val="20"/>
-          <w:szCs w:val="20"/>
-          <w:highlight w:val="yellow"/>
-        </w:rPr>
-        <w:t>SSL</w:t>
-      </w:r>
-      <w:r>
-        <w:rPr>
-          <w:rFonts w:hint="cs"/>
-          <w:sz w:val="20"/>
-          <w:szCs w:val="20"/>
-          <w:highlight w:val="yellow"/>
-          <w:rtl/>
-        </w:rPr>
-        <w:t xml:space="preserve"> אבל גם עם פיפ זה פתיר כמו שהבאתי פה)</w:t>
       </w:r>
     </w:p>
     <w:p>
@@ -9471,6 +9666,95 @@
     </w:lvl>
   </w:abstractNum>
   <w:abstractNum w:abstractNumId="5" w15:restartNumberingAfterBreak="0">
+    <w:nsid w:val="14250A9A"/>
+    <w:multiLevelType w:val="hybridMultilevel"/>
+    <w:tmpl w:val="BBCE5860"/>
+    <w:lvl w:ilvl="0" w:tplc="BD1E9F66">
+      <w:start w:val="1"/>
+      <w:numFmt w:val="hebrew1"/>
+      <w:lvlText w:val="%1."/>
+      <w:lvlJc w:val="left"/>
+      <w:pPr>
+        <w:ind w:left="360" w:hanging="360"/>
+      </w:pPr>
+      <w:rPr>
+        <w:rFonts w:hint="default"/>
+      </w:rPr>
+    </w:lvl>
+    <w:lvl w:ilvl="1" w:tplc="04090019" w:tentative="1">
+      <w:start w:val="1"/>
+      <w:numFmt w:val="lowerLetter"/>
+      <w:lvlText w:val="%2."/>
+      <w:lvlJc w:val="left"/>
+      <w:pPr>
+        <w:ind w:left="720" w:hanging="360"/>
+      </w:pPr>
+    </w:lvl>
+    <w:lvl w:ilvl="2" w:tplc="0409001B" w:tentative="1">
+      <w:start w:val="1"/>
+      <w:numFmt w:val="lowerRoman"/>
+      <w:lvlText w:val="%3."/>
+      <w:lvlJc w:val="right"/>
+      <w:pPr>
+        <w:ind w:left="1440" w:hanging="180"/>
+      </w:pPr>
+    </w:lvl>
+    <w:lvl w:ilvl="3" w:tplc="0409000F" w:tentative="1">
+      <w:start w:val="1"/>
+      <w:numFmt w:val="decimal"/>
+      <w:lvlText w:val="%4."/>
+      <w:lvlJc w:val="left"/>
+      <w:pPr>
+        <w:ind w:left="2160" w:hanging="360"/>
+      </w:pPr>
+    </w:lvl>
+    <w:lvl w:ilvl="4" w:tplc="04090019" w:tentative="1">
+      <w:start w:val="1"/>
+      <w:numFmt w:val="lowerLetter"/>
+      <w:lvlText w:val="%5."/>
+      <w:lvlJc w:val="left"/>
+      <w:pPr>
+        <w:ind w:left="2880" w:hanging="360"/>
+      </w:pPr>
+    </w:lvl>
+    <w:lvl w:ilvl="5" w:tplc="0409001B" w:tentative="1">
+      <w:start w:val="1"/>
+      <w:numFmt w:val="lowerRoman"/>
+      <w:lvlText w:val="%6."/>
+      <w:lvlJc w:val="right"/>
+      <w:pPr>
+        <w:ind w:left="3600" w:hanging="180"/>
+      </w:pPr>
+    </w:lvl>
+    <w:lvl w:ilvl="6" w:tplc="0409000F" w:tentative="1">
+      <w:start w:val="1"/>
+      <w:numFmt w:val="decimal"/>
+      <w:lvlText w:val="%7."/>
+      <w:lvlJc w:val="left"/>
+      <w:pPr>
+        <w:ind w:left="4320" w:hanging="360"/>
+      </w:pPr>
+    </w:lvl>
+    <w:lvl w:ilvl="7" w:tplc="04090019" w:tentative="1">
+      <w:start w:val="1"/>
+      <w:numFmt w:val="lowerLetter"/>
+      <w:lvlText w:val="%8."/>
+      <w:lvlJc w:val="left"/>
+      <w:pPr>
+        <w:ind w:left="5040" w:hanging="360"/>
+      </w:pPr>
+    </w:lvl>
+    <w:lvl w:ilvl="8" w:tplc="0409001B" w:tentative="1">
+      <w:start w:val="1"/>
+      <w:numFmt w:val="lowerRoman"/>
+      <w:lvlText w:val="%9."/>
+      <w:lvlJc w:val="right"/>
+      <w:pPr>
+        <w:ind w:left="5760" w:hanging="180"/>
+      </w:pPr>
+    </w:lvl>
+  </w:abstractNum>
+  <w:abstractNum w:abstractNumId="6" w15:restartNumberingAfterBreak="0">
     <w:nsid w:val="1AB65DF1"/>
     <w:multiLevelType w:val="hybridMultilevel"/>
     <w:tmpl w:val="84AEA9E6"/>
@@ -9559,10 +9843,10 @@
       </w:pPr>
     </w:lvl>
   </w:abstractNum>
-  <w:abstractNum w:abstractNumId="6" w15:restartNumberingAfterBreak="0">
+  <w:abstractNum w:abstractNumId="7" w15:restartNumberingAfterBreak="0">
     <w:nsid w:val="1B3C7A4C"/>
     <w:multiLevelType w:val="hybridMultilevel"/>
-    <w:tmpl w:val="9B94E638"/>
+    <w:tmpl w:val="5524E02E"/>
     <w:lvl w:ilvl="0" w:tplc="BD1E9F66">
       <w:start w:val="1"/>
       <w:numFmt w:val="hebrew1"/>
@@ -9584,14 +9868,17 @@
         <w:ind w:left="1800" w:hanging="360"/>
       </w:pPr>
     </w:lvl>
-    <w:lvl w:ilvl="2" w:tplc="0409001B" w:tentative="1">
-      <w:start w:val="1"/>
-      <w:numFmt w:val="lowerRoman"/>
+    <w:lvl w:ilvl="2" w:tplc="CE2ADD6E">
+      <w:start w:val="1"/>
+      <w:numFmt w:val="decimal"/>
       <w:lvlText w:val="%3."/>
-      <w:lvlJc w:val="right"/>
-      <w:pPr>
-        <w:ind w:left="2520" w:hanging="180"/>
-      </w:pPr>
+      <w:lvlJc w:val="left"/>
+      <w:pPr>
+        <w:ind w:left="2700" w:hanging="360"/>
+      </w:pPr>
+      <w:rPr>
+        <w:rFonts w:hint="default"/>
+      </w:rPr>
     </w:lvl>
     <w:lvl w:ilvl="3" w:tplc="0409000F" w:tentative="1">
       <w:start w:val="1"/>
@@ -9648,7 +9935,7 @@
       </w:pPr>
     </w:lvl>
   </w:abstractNum>
-  <w:abstractNum w:abstractNumId="7" w15:restartNumberingAfterBreak="0">
+  <w:abstractNum w:abstractNumId="8" w15:restartNumberingAfterBreak="0">
     <w:nsid w:val="1E914AB4"/>
     <w:multiLevelType w:val="hybridMultilevel"/>
     <w:tmpl w:val="83549A4E"/>
@@ -9737,7 +10024,7 @@
       </w:pPr>
     </w:lvl>
   </w:abstractNum>
-  <w:abstractNum w:abstractNumId="8" w15:restartNumberingAfterBreak="0">
+  <w:abstractNum w:abstractNumId="9" w15:restartNumberingAfterBreak="0">
     <w:nsid w:val="26751BA8"/>
     <w:multiLevelType w:val="hybridMultilevel"/>
     <w:tmpl w:val="117E8FF8"/>
@@ -9826,7 +10113,7 @@
       </w:pPr>
     </w:lvl>
   </w:abstractNum>
-  <w:abstractNum w:abstractNumId="9" w15:restartNumberingAfterBreak="0">
+  <w:abstractNum w:abstractNumId="10" w15:restartNumberingAfterBreak="0">
     <w:nsid w:val="26F00A65"/>
     <w:multiLevelType w:val="hybridMultilevel"/>
     <w:tmpl w:val="D09EC52C"/>
@@ -9915,7 +10202,7 @@
       </w:pPr>
     </w:lvl>
   </w:abstractNum>
-  <w:abstractNum w:abstractNumId="10" w15:restartNumberingAfterBreak="0">
+  <w:abstractNum w:abstractNumId="11" w15:restartNumberingAfterBreak="0">
     <w:nsid w:val="2B826018"/>
     <w:multiLevelType w:val="hybridMultilevel"/>
     <w:tmpl w:val="CF8A56A6"/>
@@ -10004,7 +10291,7 @@
       </w:pPr>
     </w:lvl>
   </w:abstractNum>
-  <w:abstractNum w:abstractNumId="11" w15:restartNumberingAfterBreak="0">
+  <w:abstractNum w:abstractNumId="12" w15:restartNumberingAfterBreak="0">
     <w:nsid w:val="2FA7678D"/>
     <w:multiLevelType w:val="hybridMultilevel"/>
     <w:tmpl w:val="0BBA35FA"/>
@@ -10117,7 +10404,7 @@
       </w:rPr>
     </w:lvl>
   </w:abstractNum>
-  <w:abstractNum w:abstractNumId="12" w15:restartNumberingAfterBreak="0">
+  <w:abstractNum w:abstractNumId="13" w15:restartNumberingAfterBreak="0">
     <w:nsid w:val="353F7DFE"/>
     <w:multiLevelType w:val="hybridMultilevel"/>
     <w:tmpl w:val="B53A2104"/>
@@ -10206,10 +10493,10 @@
       </w:pPr>
     </w:lvl>
   </w:abstractNum>
-  <w:abstractNum w:abstractNumId="13" w15:restartNumberingAfterBreak="0">
+  <w:abstractNum w:abstractNumId="14" w15:restartNumberingAfterBreak="0">
     <w:nsid w:val="368377A2"/>
     <w:multiLevelType w:val="hybridMultilevel"/>
-    <w:tmpl w:val="2AD230BC"/>
+    <w:tmpl w:val="7A22FD4A"/>
     <w:lvl w:ilvl="0" w:tplc="0409000F">
       <w:start w:val="1"/>
       <w:numFmt w:val="decimal"/>
@@ -10295,7 +10582,7 @@
       </w:pPr>
     </w:lvl>
   </w:abstractNum>
-  <w:abstractNum w:abstractNumId="14" w15:restartNumberingAfterBreak="0">
+  <w:abstractNum w:abstractNumId="15" w15:restartNumberingAfterBreak="0">
     <w:nsid w:val="4B6D5388"/>
     <w:multiLevelType w:val="hybridMultilevel"/>
     <w:tmpl w:val="A4806CCA"/>
@@ -10384,7 +10671,7 @@
       </w:pPr>
     </w:lvl>
   </w:abstractNum>
-  <w:abstractNum w:abstractNumId="15" w15:restartNumberingAfterBreak="0">
+  <w:abstractNum w:abstractNumId="16" w15:restartNumberingAfterBreak="0">
     <w:nsid w:val="4C8C6E9B"/>
     <w:multiLevelType w:val="hybridMultilevel"/>
     <w:tmpl w:val="6F28CFA2"/>
@@ -10473,7 +10760,96 @@
       </w:pPr>
     </w:lvl>
   </w:abstractNum>
-  <w:abstractNum w:abstractNumId="16" w15:restartNumberingAfterBreak="0">
+  <w:abstractNum w:abstractNumId="17" w15:restartNumberingAfterBreak="0">
+    <w:nsid w:val="500941F2"/>
+    <w:multiLevelType w:val="hybridMultilevel"/>
+    <w:tmpl w:val="5EEC0FAC"/>
+    <w:lvl w:ilvl="0" w:tplc="BD1E9F66">
+      <w:start w:val="1"/>
+      <w:numFmt w:val="hebrew1"/>
+      <w:lvlText w:val="%1."/>
+      <w:lvlJc w:val="left"/>
+      <w:pPr>
+        <w:ind w:left="1080" w:hanging="360"/>
+      </w:pPr>
+      <w:rPr>
+        <w:rFonts w:hint="default"/>
+      </w:rPr>
+    </w:lvl>
+    <w:lvl w:ilvl="1" w:tplc="04090019" w:tentative="1">
+      <w:start w:val="1"/>
+      <w:numFmt w:val="lowerLetter"/>
+      <w:lvlText w:val="%2."/>
+      <w:lvlJc w:val="left"/>
+      <w:pPr>
+        <w:ind w:left="1440" w:hanging="360"/>
+      </w:pPr>
+    </w:lvl>
+    <w:lvl w:ilvl="2" w:tplc="0409001B" w:tentative="1">
+      <w:start w:val="1"/>
+      <w:numFmt w:val="lowerRoman"/>
+      <w:lvlText w:val="%3."/>
+      <w:lvlJc w:val="right"/>
+      <w:pPr>
+        <w:ind w:left="2160" w:hanging="180"/>
+      </w:pPr>
+    </w:lvl>
+    <w:lvl w:ilvl="3" w:tplc="0409000F" w:tentative="1">
+      <w:start w:val="1"/>
+      <w:numFmt w:val="decimal"/>
+      <w:lvlText w:val="%4."/>
+      <w:lvlJc w:val="left"/>
+      <w:pPr>
+        <w:ind w:left="2880" w:hanging="360"/>
+      </w:pPr>
+    </w:lvl>
+    <w:lvl w:ilvl="4" w:tplc="04090019" w:tentative="1">
+      <w:start w:val="1"/>
+      <w:numFmt w:val="lowerLetter"/>
+      <w:lvlText w:val="%5."/>
+      <w:lvlJc w:val="left"/>
+      <w:pPr>
+        <w:ind w:left="3600" w:hanging="360"/>
+      </w:pPr>
+    </w:lvl>
+    <w:lvl w:ilvl="5" w:tplc="0409001B" w:tentative="1">
+      <w:start w:val="1"/>
+      <w:numFmt w:val="lowerRoman"/>
+      <w:lvlText w:val="%6."/>
+      <w:lvlJc w:val="right"/>
+      <w:pPr>
+        <w:ind w:left="4320" w:hanging="180"/>
+      </w:pPr>
+    </w:lvl>
+    <w:lvl w:ilvl="6" w:tplc="0409000F" w:tentative="1">
+      <w:start w:val="1"/>
+      <w:numFmt w:val="decimal"/>
+      <w:lvlText w:val="%7."/>
+      <w:lvlJc w:val="left"/>
+      <w:pPr>
+        <w:ind w:left="5040" w:hanging="360"/>
+      </w:pPr>
+    </w:lvl>
+    <w:lvl w:ilvl="7" w:tplc="04090019" w:tentative="1">
+      <w:start w:val="1"/>
+      <w:numFmt w:val="lowerLetter"/>
+      <w:lvlText w:val="%8."/>
+      <w:lvlJc w:val="left"/>
+      <w:pPr>
+        <w:ind w:left="5760" w:hanging="360"/>
+      </w:pPr>
+    </w:lvl>
+    <w:lvl w:ilvl="8" w:tplc="0409001B" w:tentative="1">
+      <w:start w:val="1"/>
+      <w:numFmt w:val="lowerRoman"/>
+      <w:lvlText w:val="%9."/>
+      <w:lvlJc w:val="right"/>
+      <w:pPr>
+        <w:ind w:left="6480" w:hanging="180"/>
+      </w:pPr>
+    </w:lvl>
+  </w:abstractNum>
+  <w:abstractNum w:abstractNumId="18" w15:restartNumberingAfterBreak="0">
     <w:nsid w:val="50744168"/>
     <w:multiLevelType w:val="hybridMultilevel"/>
     <w:tmpl w:val="F49A5634"/>
@@ -10562,7 +10938,7 @@
       </w:pPr>
     </w:lvl>
   </w:abstractNum>
-  <w:abstractNum w:abstractNumId="17" w15:restartNumberingAfterBreak="0">
+  <w:abstractNum w:abstractNumId="19" w15:restartNumberingAfterBreak="0">
     <w:nsid w:val="5D862371"/>
     <w:multiLevelType w:val="hybridMultilevel"/>
     <w:tmpl w:val="38EE902E"/>
@@ -10651,7 +11027,7 @@
       </w:pPr>
     </w:lvl>
   </w:abstractNum>
-  <w:abstractNum w:abstractNumId="18" w15:restartNumberingAfterBreak="0">
+  <w:abstractNum w:abstractNumId="20" w15:restartNumberingAfterBreak="0">
     <w:nsid w:val="6EB2730C"/>
     <w:multiLevelType w:val="hybridMultilevel"/>
     <w:tmpl w:val="AB380594"/>
@@ -10740,7 +11116,7 @@
       </w:pPr>
     </w:lvl>
   </w:abstractNum>
-  <w:abstractNum w:abstractNumId="19" w15:restartNumberingAfterBreak="0">
+  <w:abstractNum w:abstractNumId="21" w15:restartNumberingAfterBreak="0">
     <w:nsid w:val="70483864"/>
     <w:multiLevelType w:val="hybridMultilevel"/>
     <w:tmpl w:val="180CF6A4"/>
@@ -10829,7 +11205,7 @@
       </w:pPr>
     </w:lvl>
   </w:abstractNum>
-  <w:abstractNum w:abstractNumId="20" w15:restartNumberingAfterBreak="0">
+  <w:abstractNum w:abstractNumId="22" w15:restartNumberingAfterBreak="0">
     <w:nsid w:val="71AF0B85"/>
     <w:multiLevelType w:val="hybridMultilevel"/>
     <w:tmpl w:val="4DECA47A"/>
@@ -10918,7 +11294,7 @@
       </w:pPr>
     </w:lvl>
   </w:abstractNum>
-  <w:abstractNum w:abstractNumId="21" w15:restartNumberingAfterBreak="0">
+  <w:abstractNum w:abstractNumId="23" w15:restartNumberingAfterBreak="0">
     <w:nsid w:val="751754EC"/>
     <w:multiLevelType w:val="hybridMultilevel"/>
     <w:tmpl w:val="E54EA674"/>
@@ -10928,7 +11304,7 @@
       <w:lvlText w:val="-"/>
       <w:lvlJc w:val="left"/>
       <w:pPr>
-        <w:ind w:left="720" w:hanging="360"/>
+        <w:ind w:left="0" w:hanging="360"/>
       </w:pPr>
       <w:rPr>
         <w:rFonts w:ascii="Arial" w:eastAsiaTheme="minorHAnsi" w:hAnsi="Arial" w:cs="Arial" w:hint="default"/>
@@ -10940,7 +11316,7 @@
       <w:lvlText w:val="o"/>
       <w:lvlJc w:val="left"/>
       <w:pPr>
-        <w:ind w:left="1440" w:hanging="360"/>
+        <w:ind w:left="720" w:hanging="360"/>
       </w:pPr>
       <w:rPr>
         <w:rFonts w:ascii="Courier New" w:hAnsi="Courier New" w:cs="Courier New" w:hint="default"/>
@@ -10952,7 +11328,7 @@
       <w:lvlText w:val=""/>
       <w:lvlJc w:val="left"/>
       <w:pPr>
-        <w:ind w:left="2160" w:hanging="360"/>
+        <w:ind w:left="1440" w:hanging="360"/>
       </w:pPr>
       <w:rPr>
         <w:rFonts w:ascii="Wingdings" w:hAnsi="Wingdings" w:hint="default"/>
@@ -10964,7 +11340,7 @@
       <w:lvlText w:val=""/>
       <w:lvlJc w:val="left"/>
       <w:pPr>
-        <w:ind w:left="2880" w:hanging="360"/>
+        <w:ind w:left="2160" w:hanging="360"/>
       </w:pPr>
       <w:rPr>
         <w:rFonts w:ascii="Symbol" w:hAnsi="Symbol" w:hint="default"/>
@@ -10976,7 +11352,7 @@
       <w:lvlText w:val="o"/>
       <w:lvlJc w:val="left"/>
       <w:pPr>
-        <w:ind w:left="3600" w:hanging="360"/>
+        <w:ind w:left="2880" w:hanging="360"/>
       </w:pPr>
       <w:rPr>
         <w:rFonts w:ascii="Courier New" w:hAnsi="Courier New" w:cs="Courier New" w:hint="default"/>
@@ -10988,7 +11364,7 @@
       <w:lvlText w:val=""/>
       <w:lvlJc w:val="left"/>
       <w:pPr>
-        <w:ind w:left="4320" w:hanging="360"/>
+        <w:ind w:left="3600" w:hanging="360"/>
       </w:pPr>
       <w:rPr>
         <w:rFonts w:ascii="Wingdings" w:hAnsi="Wingdings" w:hint="default"/>
@@ -11000,7 +11376,7 @@
       <w:lvlText w:val=""/>
       <w:lvlJc w:val="left"/>
       <w:pPr>
-        <w:ind w:left="5040" w:hanging="360"/>
+        <w:ind w:left="4320" w:hanging="360"/>
       </w:pPr>
       <w:rPr>
         <w:rFonts w:ascii="Symbol" w:hAnsi="Symbol" w:hint="default"/>
@@ -11012,7 +11388,7 @@
       <w:lvlText w:val="o"/>
       <w:lvlJc w:val="left"/>
       <w:pPr>
-        <w:ind w:left="5760" w:hanging="360"/>
+        <w:ind w:left="5040" w:hanging="360"/>
       </w:pPr>
       <w:rPr>
         <w:rFonts w:ascii="Courier New" w:hAnsi="Courier New" w:cs="Courier New" w:hint="default"/>
@@ -11024,7 +11400,7 @@
       <w:lvlText w:val=""/>
       <w:lvlJc w:val="left"/>
       <w:pPr>
-        <w:ind w:left="6480" w:hanging="360"/>
+        <w:ind w:left="5760" w:hanging="360"/>
       </w:pPr>
       <w:rPr>
         <w:rFonts w:ascii="Wingdings" w:hAnsi="Wingdings" w:hint="default"/>
@@ -11032,7 +11408,7 @@
     </w:lvl>
   </w:abstractNum>
   <w:num w:numId="1" w16cid:durableId="975992488">
-    <w:abstractNumId w:val="9"/>
+    <w:abstractNumId w:val="10"/>
   </w:num>
   <w:num w:numId="2" w16cid:durableId="62458375">
     <w:abstractNumId w:val="2"/>
@@ -11041,61 +11417,67 @@
     <w:abstractNumId w:val="1"/>
   </w:num>
   <w:num w:numId="4" w16cid:durableId="989942448">
-    <w:abstractNumId w:val="11"/>
+    <w:abstractNumId w:val="12"/>
   </w:num>
   <w:num w:numId="5" w16cid:durableId="1357924058">
     <w:abstractNumId w:val="0"/>
   </w:num>
   <w:num w:numId="6" w16cid:durableId="1050884898">
-    <w:abstractNumId w:val="21"/>
+    <w:abstractNumId w:val="23"/>
   </w:num>
   <w:num w:numId="7" w16cid:durableId="920870158">
-    <w:abstractNumId w:val="17"/>
+    <w:abstractNumId w:val="19"/>
   </w:num>
   <w:num w:numId="8" w16cid:durableId="838353081">
-    <w:abstractNumId w:val="7"/>
+    <w:abstractNumId w:val="8"/>
   </w:num>
   <w:num w:numId="9" w16cid:durableId="1560822672">
-    <w:abstractNumId w:val="20"/>
+    <w:abstractNumId w:val="22"/>
   </w:num>
   <w:num w:numId="10" w16cid:durableId="653609050">
-    <w:abstractNumId w:val="12"/>
+    <w:abstractNumId w:val="13"/>
   </w:num>
   <w:num w:numId="11" w16cid:durableId="1947224318">
-    <w:abstractNumId w:val="8"/>
+    <w:abstractNumId w:val="9"/>
   </w:num>
   <w:num w:numId="12" w16cid:durableId="643199522">
-    <w:abstractNumId w:val="18"/>
+    <w:abstractNumId w:val="20"/>
   </w:num>
   <w:num w:numId="13" w16cid:durableId="1683705501">
     <w:abstractNumId w:val="4"/>
   </w:num>
   <w:num w:numId="14" w16cid:durableId="1514495334">
-    <w:abstractNumId w:val="15"/>
+    <w:abstractNumId w:val="16"/>
   </w:num>
   <w:num w:numId="15" w16cid:durableId="77793893">
-    <w:abstractNumId w:val="10"/>
+    <w:abstractNumId w:val="11"/>
   </w:num>
   <w:num w:numId="16" w16cid:durableId="1352757339">
-    <w:abstractNumId w:val="13"/>
+    <w:abstractNumId w:val="14"/>
   </w:num>
   <w:num w:numId="17" w16cid:durableId="1914705234">
     <w:abstractNumId w:val="3"/>
   </w:num>
   <w:num w:numId="18" w16cid:durableId="1849445102">
+    <w:abstractNumId w:val="7"/>
+  </w:num>
+  <w:num w:numId="19" w16cid:durableId="829905461">
     <w:abstractNumId w:val="6"/>
   </w:num>
-  <w:num w:numId="19" w16cid:durableId="829905461">
+  <w:num w:numId="20" w16cid:durableId="1890025149">
+    <w:abstractNumId w:val="21"/>
+  </w:num>
+  <w:num w:numId="21" w16cid:durableId="1596399679">
+    <w:abstractNumId w:val="18"/>
+  </w:num>
+  <w:num w:numId="22" w16cid:durableId="1455293825">
+    <w:abstractNumId w:val="15"/>
+  </w:num>
+  <w:num w:numId="23" w16cid:durableId="1736195616">
     <w:abstractNumId w:val="5"/>
   </w:num>
-  <w:num w:numId="20" w16cid:durableId="1890025149">
-    <w:abstractNumId w:val="19"/>
-  </w:num>
-  <w:num w:numId="21" w16cid:durableId="1596399679">
-    <w:abstractNumId w:val="16"/>
-  </w:num>
-  <w:num w:numId="22" w16cid:durableId="1455293825">
-    <w:abstractNumId w:val="14"/>
+  <w:num w:numId="24" w16cid:durableId="763766884">
+    <w:abstractNumId w:val="17"/>
   </w:num>
 </w:numbering>
 </file>

</xml_diff>

<commit_message>
add points to sunday
</commit_message>
<xml_diff>
--- a/overview.docx
+++ b/overview.docx
@@ -8752,7 +8752,6 @@
       <w:pPr>
         <w:bidi/>
         <w:rPr>
-          <w:rFonts w:hint="cs"/>
           <w:rtl/>
         </w:rPr>
       </w:pPr>
@@ -8818,7 +8817,6 @@
       <w:pPr>
         <w:bidi/>
         <w:rPr>
-          <w:rFonts w:hint="cs"/>
           <w:rtl/>
         </w:rPr>
       </w:pPr>
@@ -8875,80 +8873,133 @@
           <w:szCs w:val="20"/>
           <w:rtl/>
         </w:rPr>
-        <w:t>הבנה באיזה צורה נרצה להמשיך (התקנת הספרייה ידנית או עם קונדה? להשתמש בספריה שמגשרת בין ה</w:t>
-      </w:r>
-      <w:r>
-        <w:rPr>
-          <w:sz w:val="20"/>
-          <w:szCs w:val="20"/>
-        </w:rPr>
-        <w:t>DWG</w:t>
-      </w:r>
-      <w:r>
-        <w:rPr>
-          <w:rFonts w:hint="cs"/>
-          <w:sz w:val="20"/>
-          <w:szCs w:val="20"/>
-          <w:rtl/>
-        </w:rPr>
-        <w:t xml:space="preserve"> ל</w:t>
-      </w:r>
-      <w:r>
-        <w:rPr>
-          <w:sz w:val="20"/>
-          <w:szCs w:val="20"/>
-        </w:rPr>
-        <w:t>geojson</w:t>
-      </w:r>
-      <w:r>
-        <w:rPr>
-          <w:rFonts w:hint="cs"/>
-          <w:sz w:val="20"/>
-          <w:szCs w:val="20"/>
-          <w:rtl/>
-        </w:rPr>
-        <w:t xml:space="preserve"> (כמו </w:t>
-      </w:r>
-      <w:r>
-        <w:rPr>
-          <w:sz w:val="20"/>
-          <w:szCs w:val="20"/>
-        </w:rPr>
-        <w:t>aspose-cad</w:t>
-      </w:r>
-      <w:r>
-        <w:rPr>
-          <w:rFonts w:hint="cs"/>
-          <w:sz w:val="20"/>
-          <w:szCs w:val="20"/>
-          <w:rtl/>
-        </w:rPr>
-        <w:t xml:space="preserve">) או פתרון דומה? </w:t>
-      </w:r>
-      <w:r>
-        <w:rPr>
-          <w:rFonts w:hint="cs"/>
-          <w:sz w:val="20"/>
-          <w:szCs w:val="20"/>
-          <w:rtl/>
-        </w:rPr>
-        <w:t xml:space="preserve">לחפש פתרון אחר להמרה של </w:t>
-      </w:r>
-      <w:r>
-        <w:rPr>
-          <w:sz w:val="20"/>
-          <w:szCs w:val="20"/>
-        </w:rPr>
-        <w:t>DWG</w:t>
-      </w:r>
-      <w:r>
-        <w:rPr>
-          <w:rFonts w:hint="cs"/>
-          <w:sz w:val="20"/>
-          <w:szCs w:val="20"/>
-          <w:rtl/>
-        </w:rPr>
-        <w:t xml:space="preserve"> ל</w:t>
+        <w:t xml:space="preserve">למה לא לעבוד בצורה של </w:t>
+      </w:r>
+      <w:r>
+        <w:rPr>
+          <w:sz w:val="20"/>
+          <w:szCs w:val="20"/>
+        </w:rPr>
+        <w:t>SHELL</w:t>
+      </w:r>
+      <w:r>
+        <w:rPr>
+          <w:rFonts w:hint="cs"/>
+          <w:sz w:val="20"/>
+          <w:szCs w:val="20"/>
+          <w:rtl/>
+        </w:rPr>
+        <w:t>-</w:t>
+      </w:r>
+      <w:r>
+        <w:rPr>
+          <w:sz w:val="20"/>
+          <w:szCs w:val="20"/>
+        </w:rPr>
+        <w:t>SCRIPT</w:t>
+      </w:r>
+      <w:r>
+        <w:rPr>
+          <w:rFonts w:hint="cs"/>
+          <w:sz w:val="20"/>
+          <w:szCs w:val="20"/>
+          <w:rtl/>
+        </w:rPr>
+        <w:t xml:space="preserve"> שעושה הכל וזהו נראה לי יותר פשוט.</w:t>
+      </w:r>
+    </w:p>
+    <w:p>
+      <w:pPr>
+        <w:pStyle w:val="a9"/>
+        <w:numPr>
+          <w:ilvl w:val="0"/>
+          <w:numId w:val="12"/>
+        </w:numPr>
+        <w:bidi/>
+        <w:rPr>
+          <w:sz w:val="20"/>
+          <w:szCs w:val="20"/>
+        </w:rPr>
+      </w:pPr>
+      <w:r>
+        <w:rPr>
+          <w:rFonts w:hint="cs"/>
+          <w:sz w:val="20"/>
+          <w:szCs w:val="20"/>
+          <w:rtl/>
+        </w:rPr>
+        <w:t>המרה של הקובץ ל</w:t>
+      </w:r>
+      <w:r>
+        <w:rPr>
+          <w:sz w:val="20"/>
+          <w:szCs w:val="20"/>
+        </w:rPr>
+        <w:t>gdb</w:t>
+      </w:r>
+      <w:r>
+        <w:rPr>
+          <w:rFonts w:hint="cs"/>
+          <w:sz w:val="20"/>
+          <w:szCs w:val="20"/>
+          <w:rtl/>
+        </w:rPr>
+        <w:t xml:space="preserve"> מהצד שלי ואז מהצד של הילה והשוואה בעין ב</w:t>
+      </w:r>
+      <w:r>
+        <w:rPr>
+          <w:sz w:val="20"/>
+          <w:szCs w:val="20"/>
+        </w:rPr>
+        <w:t>ARCGIS</w:t>
+      </w:r>
+      <w:r>
+        <w:rPr>
+          <w:rFonts w:hint="cs"/>
+          <w:sz w:val="20"/>
+          <w:szCs w:val="20"/>
+          <w:rtl/>
+        </w:rPr>
+        <w:t>.</w:t>
+      </w:r>
+    </w:p>
+    <w:p>
+      <w:pPr>
+        <w:pStyle w:val="a9"/>
+        <w:numPr>
+          <w:ilvl w:val="0"/>
+          <w:numId w:val="12"/>
+        </w:numPr>
+        <w:bidi/>
+        <w:rPr>
+          <w:sz w:val="20"/>
+          <w:szCs w:val="20"/>
+        </w:rPr>
+      </w:pPr>
+      <w:r>
+        <w:rPr>
+          <w:rFonts w:hint="cs"/>
+          <w:sz w:val="20"/>
+          <w:szCs w:val="20"/>
+          <w:rtl/>
+        </w:rPr>
+        <w:t>האם עלי להמיר ל</w:t>
+      </w:r>
+      <w:r>
+        <w:rPr>
+          <w:sz w:val="20"/>
+          <w:szCs w:val="20"/>
+        </w:rPr>
+        <w:t>GDB</w:t>
+      </w:r>
+      <w:r>
+        <w:rPr>
+          <w:rFonts w:hint="cs"/>
+          <w:sz w:val="20"/>
+          <w:szCs w:val="20"/>
+          <w:rtl/>
+        </w:rPr>
+        <w:t xml:space="preserve"> או ל</w:t>
       </w:r>
       <w:r>
         <w:rPr>
@@ -8964,27 +9015,73 @@
           <w:szCs w:val="20"/>
           <w:rtl/>
         </w:rPr>
-        <w:t>)?</w:t>
-      </w:r>
-      <w:r>
-        <w:rPr>
-          <w:rFonts w:hint="cs"/>
-          <w:sz w:val="20"/>
-          <w:szCs w:val="20"/>
-          <w:rtl/>
-        </w:rPr>
-        <w:t xml:space="preserve"> </w:t>
-      </w:r>
-      <w:r>
-        <w:rPr>
-          <w:rFonts w:hint="cs"/>
-          <w:sz w:val="20"/>
-          <w:szCs w:val="20"/>
-          <w:highlight w:val="yellow"/>
-          <w:rtl/>
-        </w:rPr>
-        <w:t>ככהנ מה שחשוב זה עבודה עם לינוקס ושאר הפתרונות לא רלוונטיים</w:t>
-      </w:r>
+        <w:t xml:space="preserve"> יש את כל האפשרויות בפרוייקט שלי אבל הסקריפט של הילה מראה מעבר רק ל</w:t>
+      </w:r>
+      <w:r>
+        <w:rPr>
+          <w:sz w:val="20"/>
+          <w:szCs w:val="20"/>
+        </w:rPr>
+        <w:t>GDB</w:t>
+      </w:r>
+      <w:r>
+        <w:rPr>
+          <w:rFonts w:hint="cs"/>
+          <w:sz w:val="20"/>
+          <w:szCs w:val="20"/>
+          <w:rtl/>
+        </w:rPr>
+        <w:t>.</w:t>
+      </w:r>
+    </w:p>
+    <w:p>
+      <w:pPr>
+        <w:pStyle w:val="a9"/>
+        <w:numPr>
+          <w:ilvl w:val="0"/>
+          <w:numId w:val="12"/>
+        </w:numPr>
+        <w:bidi/>
+        <w:rPr>
+          <w:sz w:val="20"/>
+          <w:szCs w:val="20"/>
+        </w:rPr>
+      </w:pPr>
+      <w:r>
+        <w:rPr>
+          <w:rFonts w:hint="cs"/>
+          <w:sz w:val="20"/>
+          <w:szCs w:val="20"/>
+          <w:rtl/>
+        </w:rPr>
+        <w:t xml:space="preserve">כל זה עובד על </w:t>
+      </w:r>
+      <w:r>
+        <w:rPr>
+          <w:sz w:val="20"/>
+          <w:szCs w:val="20"/>
+        </w:rPr>
+        <w:t>WSL</w:t>
+      </w:r>
+      <w:r>
+        <w:rPr>
+          <w:rFonts w:hint="cs"/>
+          <w:sz w:val="20"/>
+          <w:szCs w:val="20"/>
+          <w:rtl/>
+        </w:rPr>
+        <w:t xml:space="preserve"> עכשיו נשאר לצור אימג' בדוקר שעושה בדיוק אותו דבר ולעשות גם לזה טסטים.</w:t>
+      </w:r>
+    </w:p>
+    <w:p>
+      <w:pPr>
+        <w:pStyle w:val="a9"/>
+        <w:bidi/>
+        <w:rPr>
+          <w:sz w:val="20"/>
+          <w:szCs w:val="20"/>
+        </w:rPr>
+      </w:pPr>
     </w:p>
     <w:p>
       <w:pPr>

</xml_diff>